<commit_message>
add interface and abstract class program and provided data
</commit_message>
<xml_diff>
--- a/Sem-2/Java/Java Provided/240110203_SEM_II_OOPJ_Batch-2025Java Practical List.docx
+++ b/Sem-2/Java/Java Provided/240110203_SEM_II_OOPJ_Batch-2025Java Practical List.docx
@@ -1005,6 +1005,7 @@
                 <w:sz w:val="24"/>
                 <w:szCs w:val="24"/>
               </w:rPr>
+              <w:lastRenderedPageBreak/>
               <w:t xml:space="preserve">Write a Java program to create a class named </w:t>
             </w:r>
             <w:r>
@@ -1760,6 +1761,7 @@
                 <w:sz w:val="24"/>
                 <w:szCs w:val="24"/>
               </w:rPr>
+              <w:lastRenderedPageBreak/>
               <w:t>6</w:t>
             </w:r>
           </w:p>
@@ -1846,6 +1848,7 @@
               </w:numPr>
             </w:pPr>
             <w:r>
+              <w:lastRenderedPageBreak/>
               <w:t xml:space="preserve">A constructor that accepts </w:t>
             </w:r>
             <w:r>
@@ -2466,6 +2469,7 @@
                 <w:szCs w:val="24"/>
                 <w:highlight w:val="yellow"/>
               </w:rPr>
+              <w:lastRenderedPageBreak/>
               <w:t>7</w:t>
             </w:r>
           </w:p>
@@ -2874,6 +2878,7 @@
                 <w:szCs w:val="24"/>
                 <w:highlight w:val="yellow"/>
               </w:rPr>
+              <w:lastRenderedPageBreak/>
               <w:t>8</w:t>
             </w:r>
           </w:p>
@@ -3621,6 +3626,7 @@
               </w:numPr>
             </w:pPr>
             <w:r>
+              <w:lastRenderedPageBreak/>
               <w:t xml:space="preserve">The local class should have variables </w:t>
             </w:r>
             <w:proofErr w:type="spellStart"/>
@@ -4024,6 +4030,7 @@
                 <w:sz w:val="24"/>
                 <w:szCs w:val="24"/>
               </w:rPr>
+              <w:lastRenderedPageBreak/>
               <w:t>10</w:t>
             </w:r>
           </w:p>
@@ -4649,6 +4656,7 @@
                 <w:sz w:val="24"/>
                 <w:szCs w:val="24"/>
               </w:rPr>
+              <w:lastRenderedPageBreak/>
               <w:t xml:space="preserve">Create a </w:t>
             </w:r>
             <w:r>
@@ -5208,6 +5216,7 @@
                 <w:sz w:val="24"/>
                 <w:szCs w:val="24"/>
               </w:rPr>
+              <w:lastRenderedPageBreak/>
               <w:t>11</w:t>
             </w:r>
           </w:p>
@@ -5350,8 +5359,6 @@
               </w:rPr>
               <w:t>Include the following requirements:</w:t>
             </w:r>
-            <w:bookmarkStart w:id="0" w:name="_GoBack"/>
-            <w:bookmarkEnd w:id="0"/>
           </w:p>
           <w:p>
             <w:pPr>
@@ -6085,6 +6092,7 @@
                 <w:sz w:val="24"/>
                 <w:szCs w:val="24"/>
               </w:rPr>
+              <w:lastRenderedPageBreak/>
               <w:t xml:space="preserve">Create a </w:t>
             </w:r>
             <w:r>
@@ -6362,6 +6370,7 @@
                 <w:sz w:val="24"/>
                 <w:szCs w:val="24"/>
               </w:rPr>
+              <w:lastRenderedPageBreak/>
               <w:t>12</w:t>
             </w:r>
           </w:p>
@@ -7240,6 +7249,7 @@
                 <w:sz w:val="24"/>
                 <w:szCs w:val="24"/>
               </w:rPr>
+              <w:lastRenderedPageBreak/>
               <w:t xml:space="preserve">In the </w:t>
             </w:r>
             <w:r>
@@ -7309,6 +7319,7 @@
                 <w:sz w:val="24"/>
                 <w:szCs w:val="24"/>
               </w:rPr>
+              <w:lastRenderedPageBreak/>
               <w:t>13</w:t>
             </w:r>
           </w:p>
@@ -7331,9 +7342,19 @@
               <w:rPr>
                 <w:rStyle w:val="Strong"/>
               </w:rPr>
-              <w:t xml:space="preserve">  s</w:t>
-            </w:r>
-            <w:r>
+              <w:t xml:space="preserve">  </w:t>
+            </w:r>
+            <w:r>
+              <w:rPr>
+                <w:rStyle w:val="Strong"/>
+                <w:highlight w:val="yellow"/>
+              </w:rPr>
+              <w:t>s</w:t>
+            </w:r>
+            <w:r>
+              <w:rPr>
+                <w:highlight w:val="yellow"/>
+              </w:rPr>
               <w:t>uperclass references and subclass objects</w:t>
             </w:r>
           </w:p>
@@ -7354,6 +7375,7 @@
                 <w:rFonts w:ascii="Times New Roman" w:eastAsia="Times New Roman" w:hAnsi="Times New Roman" w:cs="Times New Roman"/>
                 <w:sz w:val="24"/>
                 <w:szCs w:val="24"/>
+                <w:highlight w:val="yellow"/>
               </w:rPr>
             </w:pPr>
             <w:r>
@@ -7371,6 +7393,7 @@
                 <w:bCs/>
                 <w:sz w:val="24"/>
                 <w:szCs w:val="24"/>
+                <w:highlight w:val="yellow"/>
               </w:rPr>
               <w:t>using a superclass reference to refer to a subclass object</w:t>
             </w:r>
@@ -7379,6 +7402,7 @@
                 <w:rFonts w:ascii="Times New Roman" w:eastAsia="Times New Roman" w:hAnsi="Times New Roman" w:cs="Times New Roman"/>
                 <w:sz w:val="24"/>
                 <w:szCs w:val="24"/>
+                <w:highlight w:val="yellow"/>
               </w:rPr>
               <w:t>.</w:t>
             </w:r>
@@ -7445,6 +7469,7 @@
                 <w:rFonts w:ascii="Courier New" w:eastAsia="Times New Roman" w:hAnsi="Courier New" w:cs="Courier New"/>
                 <w:sz w:val="20"/>
                 <w:szCs w:val="20"/>
+                <w:highlight w:val="yellow"/>
               </w:rPr>
               <w:t>Vehicle</w:t>
             </w:r>
@@ -7475,6 +7500,7 @@
                 <w:rFonts w:ascii="Times New Roman" w:eastAsia="Times New Roman" w:hAnsi="Times New Roman" w:cs="Times New Roman"/>
                 <w:sz w:val="24"/>
                 <w:szCs w:val="24"/>
+                <w:highlight w:val="green"/>
               </w:rPr>
               <w:t xml:space="preserve">Method </w:t>
             </w:r>
@@ -7483,6 +7509,7 @@
                 <w:rFonts w:ascii="Courier New" w:eastAsia="Times New Roman" w:hAnsi="Courier New" w:cs="Courier New"/>
                 <w:sz w:val="20"/>
                 <w:szCs w:val="20"/>
+                <w:highlight w:val="green"/>
               </w:rPr>
               <w:t>start()</w:t>
             </w:r>
@@ -7593,6 +7620,7 @@
                 <w:rFonts w:ascii="Times New Roman" w:eastAsia="Times New Roman" w:hAnsi="Times New Roman" w:cs="Times New Roman"/>
                 <w:sz w:val="24"/>
                 <w:szCs w:val="24"/>
+                <w:highlight w:val="green"/>
               </w:rPr>
               <w:t xml:space="preserve">Method </w:t>
             </w:r>
@@ -7601,6 +7629,7 @@
                 <w:rFonts w:ascii="Courier New" w:eastAsia="Times New Roman" w:hAnsi="Courier New" w:cs="Courier New"/>
                 <w:sz w:val="20"/>
                 <w:szCs w:val="20"/>
+                <w:highlight w:val="green"/>
               </w:rPr>
               <w:t>start()</w:t>
             </w:r>
@@ -7762,6 +7791,23 @@
               </w:rPr>
               <w:t>Vehicle</w:t>
             </w:r>
+            <w:r>
+              <w:rPr>
+                <w:rFonts w:ascii="Courier New" w:eastAsia="Times New Roman" w:hAnsi="Courier New" w:cs="Courier New"/>
+                <w:sz w:val="20"/>
+                <w:szCs w:val="20"/>
+              </w:rPr>
+              <w:t xml:space="preserve"> (</w:t>
+            </w:r>
+            <w:r>
+              <w:rPr>
+                <w:rFonts w:ascii="Courier New" w:eastAsia="Times New Roman" w:hAnsi="Courier New" w:cs="Courier New"/>
+                <w:sz w:val="20"/>
+                <w:szCs w:val="20"/>
+                <w:highlight w:val="green"/>
+              </w:rPr>
+              <w:t>Vehicle v)</w:t>
+            </w:r>
           </w:p>
           <w:p>
             <w:pPr>
@@ -7800,6 +7846,23 @@
               </w:rPr>
               <w:t xml:space="preserve"> class</w:t>
             </w:r>
+            <w:r>
+              <w:rPr>
+                <w:rFonts w:ascii="Times New Roman" w:eastAsia="Times New Roman" w:hAnsi="Times New Roman" w:cs="Times New Roman"/>
+                <w:sz w:val="24"/>
+                <w:szCs w:val="24"/>
+              </w:rPr>
+              <w:t xml:space="preserve"> (</w:t>
+            </w:r>
+            <w:r>
+              <w:rPr>
+                <w:rFonts w:ascii="Times New Roman" w:eastAsia="Times New Roman" w:hAnsi="Times New Roman" w:cs="Times New Roman"/>
+                <w:sz w:val="24"/>
+                <w:szCs w:val="24"/>
+                <w:highlight w:val="green"/>
+              </w:rPr>
+              <w:t>v=new Car())</w:t>
+            </w:r>
           </w:p>
           <w:p>
             <w:pPr>
@@ -7885,6 +7948,14 @@
                 <w:szCs w:val="24"/>
               </w:rPr>
               <w:t xml:space="preserve"> using the superclass reference and observe the behavior</w:t>
+            </w:r>
+            <w:r>
+              <w:rPr>
+                <w:rFonts w:ascii="Times New Roman" w:eastAsia="Times New Roman" w:hAnsi="Times New Roman" w:cs="Times New Roman"/>
+                <w:sz w:val="24"/>
+                <w:szCs w:val="24"/>
+              </w:rPr>
+              <w:t xml:space="preserve"> </w:t>
             </w:r>
           </w:p>
           <w:p>
@@ -8468,6 +8539,7 @@
                 <w:sz w:val="24"/>
                 <w:szCs w:val="24"/>
               </w:rPr>
+              <w:lastRenderedPageBreak/>
               <w:t>14</w:t>
             </w:r>
           </w:p>
@@ -8573,6 +8645,7 @@
                 <w:rFonts w:ascii="Times New Roman" w:eastAsia="Times New Roman" w:hAnsi="Times New Roman" w:cs="Times New Roman"/>
                 <w:sz w:val="24"/>
                 <w:szCs w:val="24"/>
+                <w:highlight w:val="green"/>
               </w:rPr>
             </w:pPr>
             <w:r>
@@ -8582,6 +8655,7 @@
                 <w:bCs/>
                 <w:sz w:val="24"/>
                 <w:szCs w:val="24"/>
+                <w:highlight w:val="green"/>
               </w:rPr>
               <w:t>Final Variable:</w:t>
             </w:r>
@@ -8679,13 +8753,15 @@
                 <w:rFonts w:ascii="Times New Roman" w:eastAsia="Times New Roman" w:hAnsi="Times New Roman" w:cs="Times New Roman"/>
                 <w:sz w:val="24"/>
                 <w:szCs w:val="24"/>
-              </w:rPr>
-            </w:pPr>
-            <w:r>
-              <w:rPr>
-                <w:rFonts w:ascii="Times New Roman" w:eastAsia="Times New Roman" w:hAnsi="Times New Roman" w:cs="Times New Roman"/>
-                <w:sz w:val="24"/>
-                <w:szCs w:val="24"/>
+                <w:highlight w:val="yellow"/>
+              </w:rPr>
+            </w:pPr>
+            <w:r>
+              <w:rPr>
+                <w:rFonts w:ascii="Times New Roman" w:eastAsia="Times New Roman" w:hAnsi="Times New Roman" w:cs="Times New Roman"/>
+                <w:sz w:val="24"/>
+                <w:szCs w:val="24"/>
+                <w:highlight w:val="yellow"/>
               </w:rPr>
               <w:t xml:space="preserve">Try to change the value of </w:t>
             </w:r>
@@ -8695,6 +8771,7 @@
                 <w:rFonts w:ascii="Courier New" w:eastAsia="Times New Roman" w:hAnsi="Courier New" w:cs="Courier New"/>
                 <w:sz w:val="20"/>
                 <w:szCs w:val="20"/>
+                <w:highlight w:val="yellow"/>
               </w:rPr>
               <w:t>bankName</w:t>
             </w:r>
@@ -8704,8 +8781,18 @@
                 <w:rFonts w:ascii="Times New Roman" w:eastAsia="Times New Roman" w:hAnsi="Times New Roman" w:cs="Times New Roman"/>
                 <w:sz w:val="24"/>
                 <w:szCs w:val="24"/>
+                <w:highlight w:val="yellow"/>
               </w:rPr>
               <w:t xml:space="preserve"> and observe what happens</w:t>
+            </w:r>
+            <w:r>
+              <w:rPr>
+                <w:rFonts w:ascii="Times New Roman" w:eastAsia="Times New Roman" w:hAnsi="Times New Roman" w:cs="Times New Roman"/>
+                <w:sz w:val="24"/>
+                <w:szCs w:val="24"/>
+                <w:highlight w:val="yellow"/>
+              </w:rPr>
+              <w:t>.</w:t>
             </w:r>
           </w:p>
           <w:p>
@@ -8719,6 +8806,7 @@
                 <w:rFonts w:ascii="Times New Roman" w:eastAsia="Times New Roman" w:hAnsi="Times New Roman" w:cs="Times New Roman"/>
                 <w:sz w:val="24"/>
                 <w:szCs w:val="24"/>
+                <w:highlight w:val="green"/>
               </w:rPr>
             </w:pPr>
             <w:r>
@@ -8728,6 +8816,7 @@
                 <w:bCs/>
                 <w:sz w:val="24"/>
                 <w:szCs w:val="24"/>
+                <w:highlight w:val="green"/>
               </w:rPr>
               <w:t>Final Method:</w:t>
             </w:r>
@@ -8869,7 +8958,16 @@
                 <w:sz w:val="24"/>
                 <w:szCs w:val="24"/>
               </w:rPr>
-              <w:t xml:space="preserve"> and observe the behavior</w:t>
+              <w:t xml:space="preserve"> </w:t>
+            </w:r>
+            <w:r>
+              <w:rPr>
+                <w:rFonts w:ascii="Times New Roman" w:eastAsia="Times New Roman" w:hAnsi="Times New Roman" w:cs="Times New Roman"/>
+                <w:sz w:val="24"/>
+                <w:szCs w:val="24"/>
+                <w:highlight w:val="yellow"/>
+              </w:rPr>
+              <w:t>and observe the behavior</w:t>
             </w:r>
           </w:p>
           <w:p>
@@ -8892,8 +8990,19 @@
                 <w:bCs/>
                 <w:sz w:val="24"/>
                 <w:szCs w:val="24"/>
-              </w:rPr>
-              <w:t>Final Class:</w:t>
+                <w:highlight w:val="green"/>
+              </w:rPr>
+              <w:t>Final Class</w:t>
+            </w:r>
+            <w:r>
+              <w:rPr>
+                <w:rFonts w:ascii="Times New Roman" w:eastAsia="Times New Roman" w:hAnsi="Times New Roman" w:cs="Times New Roman"/>
+                <w:b/>
+                <w:bCs/>
+                <w:sz w:val="24"/>
+                <w:szCs w:val="24"/>
+              </w:rPr>
+              <w:t>:</w:t>
             </w:r>
           </w:p>
           <w:p>
@@ -8915,13 +9024,23 @@
                 <w:sz w:val="24"/>
                 <w:szCs w:val="24"/>
               </w:rPr>
-              <w:t xml:space="preserve">Create a </w:t>
+              <w:t xml:space="preserve">Create </w:t>
+            </w:r>
+            <w:r>
+              <w:rPr>
+                <w:rFonts w:ascii="Times New Roman" w:eastAsia="Times New Roman" w:hAnsi="Times New Roman" w:cs="Times New Roman"/>
+                <w:sz w:val="24"/>
+                <w:szCs w:val="24"/>
+                <w:highlight w:val="green"/>
+              </w:rPr>
+              <w:t xml:space="preserve">a </w:t>
             </w:r>
             <w:r>
               <w:rPr>
                 <w:rFonts w:ascii="Courier New" w:eastAsia="Times New Roman" w:hAnsi="Courier New" w:cs="Courier New"/>
                 <w:sz w:val="20"/>
                 <w:szCs w:val="20"/>
+                <w:highlight w:val="green"/>
               </w:rPr>
               <w:t>final</w:t>
             </w:r>
@@ -8930,6 +9049,7 @@
                 <w:rFonts w:ascii="Times New Roman" w:eastAsia="Times New Roman" w:hAnsi="Times New Roman" w:cs="Times New Roman"/>
                 <w:sz w:val="24"/>
                 <w:szCs w:val="24"/>
+                <w:highlight w:val="green"/>
               </w:rPr>
               <w:t xml:space="preserve"> class </w:t>
             </w:r>
@@ -8939,6 +9059,7 @@
                 <w:rFonts w:ascii="Courier New" w:eastAsia="Times New Roman" w:hAnsi="Courier New" w:cs="Courier New"/>
                 <w:sz w:val="20"/>
                 <w:szCs w:val="20"/>
+                <w:highlight w:val="green"/>
               </w:rPr>
               <w:t>FixedDeposit</w:t>
             </w:r>
@@ -9710,6 +9831,7 @@
               </w:rPr>
             </w:pPr>
             <w:r>
+              <w:lastRenderedPageBreak/>
               <w:t xml:space="preserve">Write a Java program to demonstrate </w:t>
             </w:r>
             <w:r>
@@ -10860,6 +10982,69 @@
               </w:rPr>
               <w:t xml:space="preserve"> method to print the hash codes of both objects</w:t>
             </w:r>
+          </w:p>
+          <w:p>
+            <w:pPr>
+              <w:rPr>
+                <w:rFonts w:ascii="Times New Roman" w:hAnsi="Times New Roman" w:cs="Times New Roman"/>
+                <w:sz w:val="24"/>
+                <w:szCs w:val="24"/>
+              </w:rPr>
+            </w:pPr>
+          </w:p>
+          <w:p>
+            <w:pPr>
+              <w:rPr>
+                <w:rFonts w:ascii="Times New Roman" w:hAnsi="Times New Roman" w:cs="Times New Roman"/>
+                <w:sz w:val="24"/>
+                <w:szCs w:val="24"/>
+              </w:rPr>
+            </w:pPr>
+          </w:p>
+          <w:p>
+            <w:pPr>
+              <w:rPr>
+                <w:rFonts w:ascii="Times New Roman" w:hAnsi="Times New Roman" w:cs="Times New Roman"/>
+                <w:sz w:val="24"/>
+                <w:szCs w:val="24"/>
+              </w:rPr>
+            </w:pPr>
+          </w:p>
+          <w:p>
+            <w:pPr>
+              <w:rPr>
+                <w:rFonts w:ascii="Times New Roman" w:hAnsi="Times New Roman" w:cs="Times New Roman"/>
+                <w:sz w:val="24"/>
+                <w:szCs w:val="24"/>
+              </w:rPr>
+            </w:pPr>
+          </w:p>
+          <w:p>
+            <w:pPr>
+              <w:rPr>
+                <w:rFonts w:ascii="Times New Roman" w:hAnsi="Times New Roman" w:cs="Times New Roman"/>
+                <w:sz w:val="24"/>
+                <w:szCs w:val="24"/>
+              </w:rPr>
+            </w:pPr>
+          </w:p>
+          <w:p>
+            <w:pPr>
+              <w:rPr>
+                <w:rFonts w:ascii="Times New Roman" w:hAnsi="Times New Roman" w:cs="Times New Roman"/>
+                <w:sz w:val="24"/>
+                <w:szCs w:val="24"/>
+              </w:rPr>
+            </w:pPr>
+          </w:p>
+          <w:p>
+            <w:pPr>
+              <w:rPr>
+                <w:rFonts w:ascii="Times New Roman" w:hAnsi="Times New Roman" w:cs="Times New Roman"/>
+                <w:sz w:val="24"/>
+                <w:szCs w:val="24"/>
+              </w:rPr>
+            </w:pPr>
           </w:p>
           <w:p>
             <w:pPr>
@@ -10893,6 +11078,7 @@
                 <w:sz w:val="24"/>
                 <w:szCs w:val="24"/>
               </w:rPr>
+              <w:lastRenderedPageBreak/>
               <w:t>16</w:t>
             </w:r>
           </w:p>
@@ -10905,6 +11091,15 @@
             <w:pPr>
               <w:rPr>
                 <w:rStyle w:val="Strong"/>
+                <w:rFonts w:ascii="Times New Roman" w:hAnsi="Times New Roman" w:cs="Times New Roman"/>
+                <w:sz w:val="24"/>
+              </w:rPr>
+            </w:pPr>
+          </w:p>
+          <w:p>
+            <w:pPr>
+              <w:rPr>
+                <w:rStyle w:val="Strong"/>
               </w:rPr>
             </w:pPr>
             <w:r>
@@ -10924,18 +11119,26 @@
           </w:p>
           <w:p>
             <w:pPr>
+              <w:pStyle w:val="ListParagraph"/>
+              <w:numPr>
+                <w:ilvl w:val="2"/>
+                <w:numId w:val="79"/>
+              </w:numPr>
               <w:spacing w:before="100" w:beforeAutospacing="1" w:after="100" w:afterAutospacing="1"/>
-              <w:rPr>
-                <w:rFonts w:ascii="Times New Roman" w:eastAsia="Times New Roman" w:hAnsi="Times New Roman" w:cs="Times New Roman"/>
-                <w:sz w:val="24"/>
-                <w:szCs w:val="24"/>
-              </w:rPr>
-            </w:pPr>
-            <w:r>
-              <w:rPr>
-                <w:rFonts w:ascii="Times New Roman" w:eastAsia="Times New Roman" w:hAnsi="Times New Roman" w:cs="Times New Roman"/>
-                <w:sz w:val="24"/>
-                <w:szCs w:val="24"/>
+              <w:ind w:left="1422" w:hanging="720"/>
+              <w:rPr>
+                <w:rFonts w:ascii="Times New Roman" w:eastAsia="Times New Roman" w:hAnsi="Times New Roman" w:cs="Times New Roman"/>
+                <w:sz w:val="24"/>
+                <w:szCs w:val="24"/>
+                <w:highlight w:val="yellow"/>
+              </w:rPr>
+            </w:pPr>
+            <w:r>
+              <w:rPr>
+                <w:rFonts w:ascii="Times New Roman" w:eastAsia="Times New Roman" w:hAnsi="Times New Roman" w:cs="Times New Roman"/>
+                <w:sz w:val="24"/>
+                <w:szCs w:val="24"/>
+                <w:highlight w:val="yellow"/>
               </w:rPr>
               <w:t xml:space="preserve">Write a Java program to demonstrate the use of an </w:t>
             </w:r>
@@ -10946,6 +11149,7 @@
                 <w:bCs/>
                 <w:sz w:val="24"/>
                 <w:szCs w:val="24"/>
+                <w:highlight w:val="yellow"/>
               </w:rPr>
               <w:t>interface</w:t>
             </w:r>
@@ -10954,6 +11158,7 @@
                 <w:rFonts w:ascii="Times New Roman" w:eastAsia="Times New Roman" w:hAnsi="Times New Roman" w:cs="Times New Roman"/>
                 <w:sz w:val="24"/>
                 <w:szCs w:val="24"/>
+                <w:highlight w:val="yellow"/>
               </w:rPr>
               <w:t xml:space="preserve"> by creating an interface named </w:t>
             </w:r>
@@ -10963,6 +11168,7 @@
                 <w:rFonts w:ascii="Courier New" w:eastAsia="Times New Roman" w:hAnsi="Courier New" w:cs="Courier New"/>
                 <w:sz w:val="20"/>
                 <w:szCs w:val="20"/>
+                <w:highlight w:val="yellow"/>
               </w:rPr>
               <w:t>Drawable</w:t>
             </w:r>
@@ -10972,6 +11178,7 @@
                 <w:rFonts w:ascii="Times New Roman" w:eastAsia="Times New Roman" w:hAnsi="Times New Roman" w:cs="Times New Roman"/>
                 <w:sz w:val="24"/>
                 <w:szCs w:val="24"/>
+                <w:highlight w:val="yellow"/>
               </w:rPr>
               <w:t>.</w:t>
             </w:r>
@@ -11390,6 +11597,8 @@
                 <w:szCs w:val="24"/>
               </w:rPr>
             </w:pPr>
+            <w:bookmarkStart w:id="0" w:name="_GoBack"/>
+            <w:bookmarkEnd w:id="0"/>
           </w:p>
           <w:p>
             <w:pPr>
@@ -11427,6 +11636,15 @@
                 <w:sz w:val="24"/>
                 <w:szCs w:val="24"/>
               </w:rPr>
+              <w:t xml:space="preserve">B </w:t>
+            </w:r>
+            <w:r>
+              <w:rPr>
+                <w:rFonts w:ascii="Times New Roman" w:eastAsia="Times New Roman" w:hAnsi="Times New Roman" w:cs="Times New Roman"/>
+                <w:sz w:val="24"/>
+                <w:szCs w:val="24"/>
+                <w:highlight w:val="yellow"/>
+              </w:rPr>
               <w:t xml:space="preserve">Write a Java program to demonstrate </w:t>
             </w:r>
             <w:r>
@@ -11436,6 +11654,7 @@
                 <w:bCs/>
                 <w:sz w:val="24"/>
                 <w:szCs w:val="24"/>
+                <w:highlight w:val="yellow"/>
               </w:rPr>
               <w:t>multiple inheritance</w:t>
             </w:r>
@@ -11444,6 +11663,7 @@
                 <w:rFonts w:ascii="Times New Roman" w:eastAsia="Times New Roman" w:hAnsi="Times New Roman" w:cs="Times New Roman"/>
                 <w:sz w:val="24"/>
                 <w:szCs w:val="24"/>
+                <w:highlight w:val="yellow"/>
               </w:rPr>
               <w:t xml:space="preserve"> using </w:t>
             </w:r>
@@ -11454,6 +11674,7 @@
                 <w:bCs/>
                 <w:sz w:val="24"/>
                 <w:szCs w:val="24"/>
+                <w:highlight w:val="yellow"/>
               </w:rPr>
               <w:t>interfaces</w:t>
             </w:r>
@@ -11462,6 +11683,7 @@
                 <w:rFonts w:ascii="Times New Roman" w:eastAsia="Times New Roman" w:hAnsi="Times New Roman" w:cs="Times New Roman"/>
                 <w:sz w:val="24"/>
                 <w:szCs w:val="24"/>
+                <w:highlight w:val="yellow"/>
               </w:rPr>
               <w:t xml:space="preserve"> by creating interfaces </w:t>
             </w:r>
@@ -11470,6 +11692,7 @@
                 <w:rFonts w:ascii="Courier New" w:eastAsia="Times New Roman" w:hAnsi="Courier New" w:cs="Courier New"/>
                 <w:sz w:val="20"/>
                 <w:szCs w:val="20"/>
+                <w:highlight w:val="yellow"/>
               </w:rPr>
               <w:t>Vehicle</w:t>
             </w:r>
@@ -11478,6 +11701,7 @@
                 <w:rFonts w:ascii="Times New Roman" w:eastAsia="Times New Roman" w:hAnsi="Times New Roman" w:cs="Times New Roman"/>
                 <w:sz w:val="24"/>
                 <w:szCs w:val="24"/>
+                <w:highlight w:val="yellow"/>
               </w:rPr>
               <w:t xml:space="preserve"> and </w:t>
             </w:r>
@@ -11486,6 +11710,7 @@
                 <w:rFonts w:ascii="Courier New" w:eastAsia="Times New Roman" w:hAnsi="Courier New" w:cs="Courier New"/>
                 <w:sz w:val="20"/>
                 <w:szCs w:val="20"/>
+                <w:highlight w:val="yellow"/>
               </w:rPr>
               <w:t>Electric</w:t>
             </w:r>
@@ -11494,6 +11719,7 @@
                 <w:rFonts w:ascii="Times New Roman" w:eastAsia="Times New Roman" w:hAnsi="Times New Roman" w:cs="Times New Roman"/>
                 <w:sz w:val="24"/>
                 <w:szCs w:val="24"/>
+                <w:highlight w:val="yellow"/>
               </w:rPr>
               <w:t>.</w:t>
             </w:r>
@@ -12068,6 +12294,7 @@
                 <w:sz w:val="24"/>
                 <w:szCs w:val="24"/>
               </w:rPr>
+              <w:lastRenderedPageBreak/>
               <w:t>Include the following requirements:</w:t>
             </w:r>
           </w:p>
@@ -12965,6 +13192,7 @@
                 <w:sz w:val="24"/>
                 <w:szCs w:val="24"/>
               </w:rPr>
+              <w:lastRenderedPageBreak/>
               <w:t xml:space="preserve">Divide an integer by zero (causes </w:t>
             </w:r>
             <w:proofErr w:type="spellStart"/>
@@ -13731,6 +13959,7 @@
                 <w:sz w:val="24"/>
                 <w:szCs w:val="24"/>
               </w:rPr>
+              <w:lastRenderedPageBreak/>
               <w:t>19</w:t>
             </w:r>
           </w:p>
@@ -13916,6 +14145,7 @@
               </w:numPr>
             </w:pPr>
             <w:r>
+              <w:lastRenderedPageBreak/>
               <w:t>Ensure the program continues execution after exception handling.</w:t>
             </w:r>
           </w:p>
@@ -14116,6 +14346,7 @@
                 <w:sz w:val="24"/>
                 <w:szCs w:val="24"/>
               </w:rPr>
+              <w:lastRenderedPageBreak/>
               <w:t>20</w:t>
             </w:r>
           </w:p>
@@ -14544,6 +14775,7 @@
               <w:pStyle w:val="NormalWeb"/>
             </w:pPr>
             <w:r>
+              <w:lastRenderedPageBreak/>
               <w:t xml:space="preserve">Write a Java program to demonstrate a </w:t>
             </w:r>
             <w:r>
@@ -15010,6 +15242,7 @@
                 <w:sz w:val="24"/>
                 <w:szCs w:val="24"/>
               </w:rPr>
+              <w:lastRenderedPageBreak/>
               <w:t>22</w:t>
             </w:r>
           </w:p>
@@ -15244,6 +15477,7 @@
               <w:pStyle w:val="NormalWeb"/>
             </w:pPr>
             <w:r>
+              <w:lastRenderedPageBreak/>
               <w:t xml:space="preserve">Write a Java program to demonstrate the use of the </w:t>
             </w:r>
             <w:r>
@@ -15435,6 +15669,7 @@
                 <w:sz w:val="24"/>
                 <w:szCs w:val="24"/>
               </w:rPr>
+              <w:lastRenderedPageBreak/>
               <w:t>23</w:t>
             </w:r>
           </w:p>
@@ -15934,6 +16169,7 @@
                 <w:sz w:val="24"/>
                 <w:szCs w:val="24"/>
               </w:rPr>
+              <w:lastRenderedPageBreak/>
               <w:t>24</w:t>
             </w:r>
           </w:p>
@@ -16870,6 +17106,7 @@
               </w:numPr>
             </w:pPr>
             <w:r>
+              <w:lastRenderedPageBreak/>
               <w:t xml:space="preserve">Override the </w:t>
             </w:r>
             <w:proofErr w:type="gramStart"/>
@@ -16973,6 +17210,7 @@
                 <w:sz w:val="24"/>
                 <w:szCs w:val="24"/>
               </w:rPr>
+              <w:lastRenderedPageBreak/>
               <w:t>26</w:t>
             </w:r>
           </w:p>
@@ -17636,6 +17874,7 @@
               </w:numPr>
             </w:pPr>
             <w:r>
+              <w:lastRenderedPageBreak/>
               <w:t>Start all threads and observe how priorities affect execution.</w:t>
             </w:r>
           </w:p>
@@ -17836,6 +18075,7 @@
     </w:tbl>
     <w:p>
       <w:r>
+        <w:lastRenderedPageBreak/>
         <w:br w:type="page"/>
       </w:r>
     </w:p>
@@ -17870,6 +18110,7 @@
                 <w:sz w:val="24"/>
                 <w:szCs w:val="24"/>
               </w:rPr>
+              <w:lastRenderedPageBreak/>
               <w:t>28</w:t>
             </w:r>
           </w:p>
@@ -18500,6 +18741,7 @@
               <w:rPr>
                 <w:rStyle w:val="Strong"/>
               </w:rPr>
+              <w:lastRenderedPageBreak/>
               <w:t>Concepts:</w:t>
             </w:r>
             <w:r>
@@ -18659,6 +18901,7 @@
                 <w:sz w:val="24"/>
                 <w:szCs w:val="24"/>
               </w:rPr>
+              <w:lastRenderedPageBreak/>
               <w:t>3</w:t>
             </w:r>
             <w:r>
@@ -19174,6 +19417,7 @@
               <w:rPr>
                 <w:rStyle w:val="Strong"/>
               </w:rPr>
+              <w:lastRenderedPageBreak/>
               <w:t>Concepts:</w:t>
             </w:r>
             <w:r>
@@ -19355,6 +19599,7 @@
                 <w:sz w:val="24"/>
                 <w:szCs w:val="24"/>
               </w:rPr>
+              <w:lastRenderedPageBreak/>
               <w:t>3</w:t>
             </w:r>
             <w:r>
@@ -19851,6 +20096,7 @@
                 <w:sz w:val="24"/>
                 <w:szCs w:val="24"/>
               </w:rPr>
+              <w:lastRenderedPageBreak/>
               <w:t>3</w:t>
             </w:r>
             <w:r>
@@ -20643,6 +20889,7 @@
               </w:numPr>
             </w:pPr>
             <w:r>
+              <w:lastRenderedPageBreak/>
               <w:t xml:space="preserve">When a </w:t>
             </w:r>
             <w:r>
@@ -20703,6 +20950,7 @@
                 <w:sz w:val="24"/>
                 <w:szCs w:val="24"/>
               </w:rPr>
+              <w:lastRenderedPageBreak/>
               <w:t>3</w:t>
             </w:r>
             <w:r>
@@ -28782,7 +29030,7 @@
   <w:abstractNum w:abstractNumId="65">
     <w:nsid w:val="684266BE"/>
     <w:multiLevelType w:val="multilevel"/>
-    <w:tmpl w:val="EBFEFA08"/>
+    <w:tmpl w:val="1608B314"/>
     <w:lvl w:ilvl="0">
       <w:start w:val="1"/>
       <w:numFmt w:val="bullet"/>
@@ -28810,17 +29058,17 @@
         <w:ind w:left="1440" w:hanging="360"/>
       </w:pPr>
     </w:lvl>
-    <w:lvl w:ilvl="2" w:tentative="1">
-      <w:start w:val="1"/>
-      <w:numFmt w:val="decimal"/>
+    <w:lvl w:ilvl="2">
+      <w:start w:val="1"/>
+      <w:numFmt w:val="upperLetter"/>
       <w:lvlText w:val="%3."/>
       <w:lvlJc w:val="left"/>
       <w:pPr>
-        <w:tabs>
-          <w:tab w:val="num" w:pos="2160"/>
-        </w:tabs>
         <w:ind w:left="2160" w:hanging="360"/>
       </w:pPr>
+      <w:rPr>
+        <w:rFonts w:hint="default"/>
+      </w:rPr>
     </w:lvl>
     <w:lvl w:ilvl="3" w:tentative="1">
       <w:start w:val="1"/>

</xml_diff>

<commit_message>
java costom exception, throw and throws
</commit_message>
<xml_diff>
--- a/Sem-2/Java/Java Provided/240110203_SEM_II_OOPJ_Batch-2025Java Practical List.docx
+++ b/Sem-2/Java/Java Provided/240110203_SEM_II_OOPJ_Batch-2025Java Practical List.docx
@@ -267,7 +267,6 @@
               </w:rPr>
               <w:t xml:space="preserve">, and using </w:t>
             </w:r>
-            <w:proofErr w:type="spellStart"/>
             <w:proofErr w:type="gramStart"/>
             <w:r>
               <w:rPr>
@@ -275,16 +274,7 @@
                 <w:sz w:val="20"/>
                 <w:szCs w:val="20"/>
               </w:rPr>
-              <w:t>System.out.println</w:t>
-            </w:r>
-            <w:proofErr w:type="spellEnd"/>
-            <w:r>
-              <w:rPr>
-                <w:rFonts w:ascii="Courier New" w:eastAsia="Times New Roman" w:hAnsi="Courier New" w:cs="Courier New"/>
-                <w:sz w:val="20"/>
-                <w:szCs w:val="20"/>
-              </w:rPr>
-              <w:t>(</w:t>
+              <w:t>System.out.println(</w:t>
             </w:r>
             <w:proofErr w:type="gramEnd"/>
             <w:r>
@@ -9771,6 +9761,15 @@
               </w:rPr>
             </w:pPr>
           </w:p>
+          <w:p>
+            <w:pPr>
+              <w:rPr>
+                <w:rFonts w:ascii="Times New Roman" w:hAnsi="Times New Roman" w:cs="Times New Roman"/>
+                <w:sz w:val="24"/>
+                <w:szCs w:val="24"/>
+              </w:rPr>
+            </w:pPr>
+          </w:p>
         </w:tc>
       </w:tr>
       <w:tr>
@@ -9794,6 +9793,7 @@
                 <w:sz w:val="24"/>
                 <w:szCs w:val="24"/>
               </w:rPr>
+              <w:lastRenderedPageBreak/>
               <w:t>15</w:t>
             </w:r>
           </w:p>
@@ -9831,7 +9831,6 @@
               </w:rPr>
             </w:pPr>
             <w:r>
-              <w:lastRenderedPageBreak/>
               <w:t xml:space="preserve">Write a Java program to demonstrate </w:t>
             </w:r>
             <w:r>
@@ -11597,8 +11596,6 @@
                 <w:szCs w:val="24"/>
               </w:rPr>
             </w:pPr>
-            <w:bookmarkStart w:id="0" w:name="_GoBack"/>
-            <w:bookmarkEnd w:id="0"/>
           </w:p>
           <w:p>
             <w:pPr>
@@ -12171,6 +12168,60 @@
               </w:rPr>
               <w:t xml:space="preserve"> methods</w:t>
             </w:r>
+          </w:p>
+          <w:p>
+            <w:pPr>
+              <w:rPr>
+                <w:rFonts w:ascii="Times New Roman" w:hAnsi="Times New Roman" w:cs="Times New Roman"/>
+                <w:sz w:val="24"/>
+                <w:szCs w:val="24"/>
+              </w:rPr>
+            </w:pPr>
+          </w:p>
+          <w:p>
+            <w:pPr>
+              <w:rPr>
+                <w:rFonts w:ascii="Times New Roman" w:hAnsi="Times New Roman" w:cs="Times New Roman"/>
+                <w:sz w:val="24"/>
+                <w:szCs w:val="24"/>
+              </w:rPr>
+            </w:pPr>
+          </w:p>
+          <w:p>
+            <w:pPr>
+              <w:rPr>
+                <w:rFonts w:ascii="Times New Roman" w:hAnsi="Times New Roman" w:cs="Times New Roman"/>
+                <w:sz w:val="24"/>
+                <w:szCs w:val="24"/>
+              </w:rPr>
+            </w:pPr>
+          </w:p>
+          <w:p>
+            <w:pPr>
+              <w:rPr>
+                <w:rFonts w:ascii="Times New Roman" w:hAnsi="Times New Roman" w:cs="Times New Roman"/>
+                <w:sz w:val="24"/>
+                <w:szCs w:val="24"/>
+              </w:rPr>
+            </w:pPr>
+          </w:p>
+          <w:p>
+            <w:pPr>
+              <w:rPr>
+                <w:rFonts w:ascii="Times New Roman" w:hAnsi="Times New Roman" w:cs="Times New Roman"/>
+                <w:sz w:val="24"/>
+                <w:szCs w:val="24"/>
+              </w:rPr>
+            </w:pPr>
+          </w:p>
+          <w:p>
+            <w:pPr>
+              <w:rPr>
+                <w:rFonts w:ascii="Times New Roman" w:hAnsi="Times New Roman" w:cs="Times New Roman"/>
+                <w:sz w:val="24"/>
+                <w:szCs w:val="24"/>
+              </w:rPr>
+            </w:pPr>
           </w:p>
           <w:p>
             <w:pPr>
@@ -12204,6 +12255,7 @@
                 <w:sz w:val="24"/>
                 <w:szCs w:val="24"/>
               </w:rPr>
+              <w:lastRenderedPageBreak/>
               <w:t>17</w:t>
             </w:r>
           </w:p>
@@ -12214,16 +12266,6 @@
           </w:tcPr>
           <w:p>
             <w:pPr>
-              <w:spacing w:before="100" w:beforeAutospacing="1" w:after="100" w:afterAutospacing="1"/>
-              <w:rPr>
-                <w:rFonts w:ascii="Times New Roman" w:eastAsia="Times New Roman" w:hAnsi="Times New Roman" w:cs="Times New Roman"/>
-                <w:sz w:val="24"/>
-                <w:szCs w:val="24"/>
-              </w:rPr>
-            </w:pPr>
-          </w:p>
-          <w:p>
-            <w:pPr>
               <w:rPr>
                 <w:rStyle w:val="Strong"/>
               </w:rPr>
@@ -12240,7 +12282,13 @@
               <w:rPr>
                 <w:rStyle w:val="Strong"/>
               </w:rPr>
-              <w:t xml:space="preserve">  exception handling</w:t>
+              <w:t xml:space="preserve">  E</w:t>
+            </w:r>
+            <w:r>
+              <w:rPr>
+                <w:rStyle w:val="Strong"/>
+              </w:rPr>
+              <w:t>xception handling</w:t>
             </w:r>
           </w:p>
           <w:p>
@@ -12294,7 +12342,6 @@
                 <w:sz w:val="24"/>
                 <w:szCs w:val="24"/>
               </w:rPr>
-              <w:lastRenderedPageBreak/>
               <w:t>Include the following requirements:</w:t>
             </w:r>
           </w:p>
@@ -12968,6 +13015,33 @@
               </w:rPr>
               <w:t>The stack trace printed by the JVM</w:t>
             </w:r>
+          </w:p>
+          <w:p>
+            <w:pPr>
+              <w:rPr>
+                <w:rFonts w:ascii="Times New Roman" w:hAnsi="Times New Roman" w:cs="Times New Roman"/>
+                <w:sz w:val="24"/>
+                <w:szCs w:val="24"/>
+              </w:rPr>
+            </w:pPr>
+          </w:p>
+          <w:p>
+            <w:pPr>
+              <w:rPr>
+                <w:rFonts w:ascii="Times New Roman" w:hAnsi="Times New Roman" w:cs="Times New Roman"/>
+                <w:sz w:val="24"/>
+                <w:szCs w:val="24"/>
+              </w:rPr>
+            </w:pPr>
+          </w:p>
+          <w:p>
+            <w:pPr>
+              <w:rPr>
+                <w:rFonts w:ascii="Times New Roman" w:hAnsi="Times New Roman" w:cs="Times New Roman"/>
+                <w:sz w:val="24"/>
+                <w:szCs w:val="24"/>
+              </w:rPr>
+            </w:pPr>
           </w:p>
           <w:p>
             <w:pPr>
@@ -13069,6 +13143,7 @@
                 <w:rFonts w:ascii="Times New Roman" w:hAnsi="Times New Roman" w:cs="Times New Roman"/>
                 <w:sz w:val="24"/>
               </w:rPr>
+              <w:lastRenderedPageBreak/>
               <w:t>Concepts:</w:t>
             </w:r>
             <w:r>
@@ -13192,7 +13267,6 @@
                 <w:sz w:val="24"/>
                 <w:szCs w:val="24"/>
               </w:rPr>
-              <w:lastRenderedPageBreak/>
               <w:t xml:space="preserve">Divide an integer by zero (causes </w:t>
             </w:r>
             <w:proofErr w:type="spellStart"/>
@@ -13532,6 +13606,7 @@
                 <w:szCs w:val="24"/>
               </w:rPr>
             </w:pPr>
+            <w:bookmarkStart w:id="0" w:name="_GoBack"/>
             <w:r>
               <w:rPr>
                 <w:rFonts w:ascii="Times New Roman" w:eastAsia="Times New Roman" w:hAnsi="Times New Roman" w:cs="Times New Roman"/>
@@ -13917,6 +13992,7 @@
               <w:t>"Execution finished"</w:t>
             </w:r>
           </w:p>
+          <w:bookmarkEnd w:id="0"/>
           <w:p>
             <w:pPr>
               <w:spacing w:before="100" w:beforeAutospacing="1" w:after="100" w:afterAutospacing="1"/>
@@ -14018,6 +14094,7 @@
               </w:numPr>
             </w:pPr>
             <w:r>
+              <w:lastRenderedPageBreak/>
               <w:t xml:space="preserve">Declare two integers and perform </w:t>
             </w:r>
             <w:r>
@@ -14145,7 +14222,6 @@
               </w:numPr>
             </w:pPr>
             <w:r>
-              <w:lastRenderedPageBreak/>
               <w:t>Ensure the program continues execution after exception handling.</w:t>
             </w:r>
           </w:p>
@@ -14682,6 +14758,7 @@
               </w:numPr>
             </w:pPr>
             <w:r>
+              <w:lastRenderedPageBreak/>
               <w:t xml:space="preserve">Handle each exception using </w:t>
             </w:r>
             <w:r>
@@ -14738,6 +14815,7 @@
                 <w:sz w:val="24"/>
                 <w:szCs w:val="24"/>
               </w:rPr>
+              <w:lastRenderedPageBreak/>
               <w:t>21</w:t>
             </w:r>
           </w:p>
@@ -14775,7 +14853,6 @@
               <w:pStyle w:val="NormalWeb"/>
             </w:pPr>
             <w:r>
-              <w:lastRenderedPageBreak/>
               <w:t xml:space="preserve">Write a Java program to demonstrate a </w:t>
             </w:r>
             <w:r>
@@ -15242,7 +15319,6 @@
                 <w:sz w:val="24"/>
                 <w:szCs w:val="24"/>
               </w:rPr>
-              <w:lastRenderedPageBreak/>
               <w:t>22</w:t>
             </w:r>
           </w:p>
@@ -15438,6 +15514,7 @@
               </w:numPr>
             </w:pPr>
             <w:r>
+              <w:lastRenderedPageBreak/>
               <w:t>Display the final list after all operations</w:t>
             </w:r>
           </w:p>
@@ -15477,7 +15554,6 @@
               <w:pStyle w:val="NormalWeb"/>
             </w:pPr>
             <w:r>
-              <w:lastRenderedPageBreak/>
               <w:t xml:space="preserve">Write a Java program to demonstrate the use of the </w:t>
             </w:r>
             <w:r>
@@ -16088,6 +16164,7 @@
               </w:numPr>
             </w:pPr>
             <w:r>
+              <w:lastRenderedPageBreak/>
               <w:t xml:space="preserve">Remove an element using its </w:t>
             </w:r>
             <w:r>
@@ -17048,6 +17125,7 @@
               <w:pStyle w:val="NormalWeb"/>
             </w:pPr>
             <w:r>
+              <w:lastRenderedPageBreak/>
               <w:t xml:space="preserve">Write a Java program to demonstrate the use of the </w:t>
             </w:r>
             <w:r>
@@ -17106,7 +17184,6 @@
               </w:numPr>
             </w:pPr>
             <w:r>
-              <w:lastRenderedPageBreak/>
               <w:t xml:space="preserve">Override the </w:t>
             </w:r>
             <w:proofErr w:type="gramStart"/>
@@ -17736,6 +17813,7 @@
               <w:pStyle w:val="NormalWeb"/>
             </w:pPr>
             <w:r>
+              <w:lastRenderedPageBreak/>
               <w:t xml:space="preserve">Write a Java program to demonstrate the use of </w:t>
             </w:r>
             <w:r>
@@ -17874,7 +17952,6 @@
               </w:numPr>
             </w:pPr>
             <w:r>
-              <w:lastRenderedPageBreak/>
               <w:t>Start all threads and observe how priorities affect execution.</w:t>
             </w:r>
           </w:p>

</xml_diff>